<commit_message>
Simplify customer form workflow and centralize document actions
</commit_message>
<xml_diff>
--- a/output/documents/kyc-corporate.docx
+++ b/output/documents/kyc-corporate.docx
@@ -6152,207 +6152,6 @@
                 <w:sz w:val="15"/>
               </w:rPr>
               <w:t>⁦ID No⁩</w:t>
-            </w:r>
-          </w:p>
-          <w:p>
-            <w:pPr>
-              <w:keepNext w:val="0"/>
-              <w:spacing w:before="0" w:after="0" w:line="480" w:lineRule="exact"/>
-              <w:jc w:val="left"/>
-            </w:pPr>
-            <w:r>
-              <w:rPr>
-                <w:rFonts w:ascii="Arial" w:hAnsi="Arial" w:cs="Bahij TheSansArabic Plain"/>
-                <w:b w:val="0"/>
-                <w:color w:val="242235"/>
-                <w:sz w:val="4"/>
-              </w:rPr>
-            </w:r>
-            <w:r>
-              <w:rPr>
-                <w:rFonts w:ascii="Arial" w:hAnsi="Arial" w:cs="Bahij TheSansArabic Plain"/>
-                <w:b w:val="0"/>
-                <w:color w:val="242235"/>
-                <w:sz w:val="4"/>
-              </w:rPr>
-              <w:t xml:space="preserve"> </w:t>
-            </w:r>
-          </w:p>
-        </w:tc>
-        <w:tc>
-          <w:tcPr>
-            <w:tcW w:type="dxa" w:w="4993"/>
-            <w:tcMar>
-              <w:top w:w="65" w:type="dxa"/>
-              <w:bottom w:w="55" w:type="dxa"/>
-              <w:left w:w="100" w:type="dxa"/>
-              <w:right w:w="100" w:type="dxa"/>
-            </w:tcMar>
-            <w:vAlign w:val="bottom"/>
-          </w:tcPr>
-          <w:p>
-            <w:pPr>
-              <w:keepNext w:val="0"/>
-              <w:spacing w:before="0" w:after="0" w:line="280" w:lineRule="exact"/>
-              <w:jc w:val="left"/>
-            </w:pPr>
-            <w:r>
-              <w:rPr>
-                <w:rFonts w:ascii="Arial" w:hAnsi="Arial" w:cs="Bahij TheSansArabic Plain"/>
-                <w:b w:val="0"/>
-                <w:color w:val="242235"/>
-                <w:sz w:val="18"/>
-              </w:rPr>
-            </w:r>
-            <w:r>
-              <w:rPr>
-                <w:rFonts w:ascii="Bahij TheSansArabic Plain" w:hAnsi="Bahij TheSansArabic Plain" w:cs="Bahij TheSansArabic Plain"/>
-                <w:b w:val="0"/>
-                <w:color w:val="242235"/>
-                <w:sz w:val="19"/>
-                <w:rtl/>
-                <w:szCs w:val="19"/>
-              </w:rPr>
-              <w:t>⁧مكان الإصدار⁩</w:t>
-            </w:r>
-            <w:r>
-              <w:rPr>
-                <w:rFonts w:ascii="Arial" w:hAnsi="Arial" w:cs="Bahij TheSansArabic Plain"/>
-                <w:b w:val="0"/>
-                <w:color w:val="656575"/>
-                <w:sz w:val="16"/>
-              </w:rPr>
-              <w:t xml:space="preserve"> / </w:t>
-            </w:r>
-            <w:r>
-              <w:rPr>
-                <w:rFonts w:ascii="Arial" w:hAnsi="Arial" w:cs="Bahij TheSansArabic Plain"/>
-                <w:b w:val="0"/>
-                <w:color w:val="656575"/>
-                <w:sz w:val="15"/>
-              </w:rPr>
-              <w:t>⁦Place of Issue⁩</w:t>
-            </w:r>
-          </w:p>
-          <w:p>
-            <w:pPr>
-              <w:keepNext w:val="0"/>
-              <w:spacing w:before="0" w:after="0" w:line="480" w:lineRule="exact"/>
-              <w:jc w:val="left"/>
-            </w:pPr>
-            <w:r>
-              <w:rPr>
-                <w:rFonts w:ascii="Arial" w:hAnsi="Arial" w:cs="Bahij TheSansArabic Plain"/>
-                <w:b w:val="0"/>
-                <w:color w:val="242235"/>
-                <w:sz w:val="4"/>
-              </w:rPr>
-            </w:r>
-            <w:r>
-              <w:rPr>
-                <w:rFonts w:ascii="Arial" w:hAnsi="Arial" w:cs="Bahij TheSansArabic Plain"/>
-                <w:b w:val="0"/>
-                <w:color w:val="242235"/>
-                <w:sz w:val="4"/>
-              </w:rPr>
-              <w:t xml:space="preserve"> </w:t>
-            </w:r>
-          </w:p>
-        </w:tc>
-      </w:tr>
-    </w:tbl>
-    <w:p>
-      <w:pPr>
-        <w:keepNext w:val="0"/>
-        <w:spacing w:before="0" w:after="0" w:line="2" w:lineRule="exact"/>
-        <w:jc w:val="left"/>
-      </w:pPr>
-      <w:r>
-        <w:rPr>
-          <w:rFonts w:ascii="Arial" w:hAnsi="Arial" w:cs="Bahij TheSansArabic Plain"/>
-          <w:b w:val="0"/>
-          <w:color w:val="242235"/>
-          <w:sz w:val="2"/>
-        </w:rPr>
-        <w:t xml:space="preserve"> </w:t>
-      </w:r>
-    </w:p>
-    <w:tbl>
-      <w:tblPr>
-        <w:tblW w:type="auto" w:w="0"/>
-        <w:jc w:val="center"/>
-        <w:tblLayout w:type="fixed"/>
-        <w:tblLook w:firstColumn="1" w:firstRow="1" w:lastColumn="0" w:lastRow="0" w:noHBand="0" w:noVBand="1" w:val="04A0"/>
-        <w:tblBorders>
-          <w:top w:val="single" w:sz="3" w:color="9B92A2"/>
-          <w:bottom w:val="single" w:sz="3" w:color="9B92A2"/>
-          <w:left w:val="single" w:sz="3" w:color="9B92A2"/>
-          <w:right w:val="single" w:sz="3" w:color="9B92A2"/>
-          <w:insideH w:val="single" w:sz="3" w:color="9B92A2"/>
-          <w:insideV w:val="single" w:sz="3" w:color="9B92A2"/>
-        </w:tblBorders>
-      </w:tblPr>
-      <w:tblGrid>
-        <w:gridCol w:w="4993"/>
-        <w:gridCol w:w="4993"/>
-      </w:tblGrid>
-      <w:tr>
-        <w:trPr>
-          <w:cantSplit/>
-        </w:trPr>
-        <w:tc>
-          <w:tcPr>
-            <w:tcW w:type="dxa" w:w="4993"/>
-            <w:tcMar>
-              <w:top w:w="65" w:type="dxa"/>
-              <w:bottom w:w="55" w:type="dxa"/>
-              <w:left w:w="100" w:type="dxa"/>
-              <w:right w:w="100" w:type="dxa"/>
-            </w:tcMar>
-            <w:vAlign w:val="bottom"/>
-          </w:tcPr>
-          <w:p>
-            <w:pPr>
-              <w:keepNext w:val="0"/>
-              <w:spacing w:before="0" w:after="0" w:line="280" w:lineRule="exact"/>
-              <w:jc w:val="left"/>
-            </w:pPr>
-            <w:r>
-              <w:rPr>
-                <w:rFonts w:ascii="Arial" w:hAnsi="Arial" w:cs="Bahij TheSansArabic Plain"/>
-                <w:b w:val="0"/>
-                <w:color w:val="242235"/>
-                <w:sz w:val="18"/>
-              </w:rPr>
-            </w:r>
-            <w:r>
-              <w:rPr>
-                <w:rFonts w:ascii="Bahij TheSansArabic Plain" w:hAnsi="Bahij TheSansArabic Plain" w:cs="Bahij TheSansArabic Plain"/>
-                <w:b w:val="0"/>
-                <w:color w:val="242235"/>
-                <w:sz w:val="19"/>
-                <w:rtl/>
-                <w:szCs w:val="19"/>
-              </w:rPr>
-              <w:t>⁧تاريخ الإصدار⁩</w:t>
-            </w:r>
-            <w:r>
-              <w:rPr>
-                <w:rFonts w:ascii="Arial" w:hAnsi="Arial" w:cs="Bahij TheSansArabic Plain"/>
-                <w:b w:val="0"/>
-                <w:color w:val="656575"/>
-                <w:sz w:val="16"/>
-              </w:rPr>
-              <w:t xml:space="preserve"> / </w:t>
-            </w:r>
-            <w:r>
-              <w:rPr>
-                <w:rFonts w:ascii="Arial" w:hAnsi="Arial" w:cs="Bahij TheSansArabic Plain"/>
-                <w:b w:val="0"/>
-                <w:color w:val="656575"/>
-                <w:sz w:val="15"/>
-              </w:rPr>
-              <w:t>⁦Date of Issue⁩</w:t>
             </w:r>
           </w:p>
           <w:p>
@@ -14476,11 +14275,6 @@
           <w:sz w:val="2"/>
         </w:rPr>
         <w:t xml:space="preserve"> </w:t>
-      </w:r>
-    </w:p>
-    <w:p>
-      <w:r>
-        <w:br w:type="page"/>
       </w:r>
     </w:p>
     <w:p>

</xml_diff>

<commit_message>
Update Itqan national address on KYC templates
</commit_message>
<xml_diff>
--- a/output/documents/kyc-corporate.docx
+++ b/output/documents/kyc-corporate.docx
@@ -18856,20 +18856,18 @@
   </w:p>
   <w:p>
     <w:pPr>
+      <w:keepNext w:val="0"/>
       <w:spacing w:before="0" w:after="0" w:line="180" w:lineRule="exact"/>
-      <w:jc w:val="start"/>
-      <w:bidi/>
+      <w:jc w:val="center"/>
     </w:pPr>
     <w:r>
       <w:rPr>
-        <w:rFonts w:ascii="Bahij TheSansArabic Plain" w:hAnsi="Bahij TheSansArabic Plain" w:cs="Bahij TheSansArabic Plain"/>
+        <w:rFonts w:ascii="Arial" w:hAnsi="Arial" w:cs="Bahij TheSansArabic Plain"/>
         <w:b w:val="0"/>
         <w:color w:val="656575"/>
-        <w:sz w:val="13"/>
-        <w:rtl/>
-        <w:szCs w:val="13"/>
-      </w:rPr>
-      <w:t>7855 أحمد العطاس، حي الزهراء، وحدة 2563، جدة 23425-2753، المملكة العربية السعودية</w:t>
+        <w:sz w:val="14"/>
+      </w:rPr>
+      <w:t>Al Zahraa District - Prince Naif Branch - Al Saha Square, 1st Floor | 2505 - Al Zahra Dist | Unit No 7940 | Jeddah 23425-2753 | Kingdom of Saudi Arabia</w:t>
     </w:r>
   </w:p>
   <w:p>

</xml_diff>